<commit_message>
Fix artifact contents and revision-history ordering
The previous commit staged the renamed documents with git mv, which
captured their pre-edit content: the published SCO, IRP and REG binaries
were the old v1.2, v1.2 and v1.0 documents under the new filenames, so
none of the entity-classification corrections were actually delivered.
Re-stage the edited DOCX sources and their re-exported PDFs.

Order the revision-history tables chronologically. The v1.1 rows had been
appended after v1.2 rather than inserted after 1.0, so SCO, IRP and POL
read 1.0 / 1.2 / 1.1 (/ 1.3) instead of ascending.

Correct the SoA v1.2 version-history cell that stored 1.1 as the float
1.1000000000000001 instead of text.

Exports remain A4 with no blank pages: POL 12pp, SCO 18pp, IRP 6pp.
</commit_message>
<xml_diff>
--- a/1_Governance_and_Scope/MT-ISMS-POL-001_v1.2_infosec-policy.docx
+++ b/1_Governance_and_Scope/MT-ISMS-POL-001_v1.2_infosec-policy.docx
@@ -574,7 +574,7 @@
               <w:rPr>
                 <w:rFonts w:ascii="Arial" w:hAnsi="Arial" w:cs="Arial"/>
               </w:rPr>
-              <w:t>1.2</w:t>
+              <w:t>1.1</w:t>
             </w:r>
           </w:p>
         </w:tc>
@@ -634,7 +634,7 @@
               <w:rPr>
                 <w:rFonts w:ascii="Arial" w:hAnsi="Arial" w:cs="Arial"/>
               </w:rPr>
-              <w:t>Citation correction: BaFin BAIT, withdrawn when DORA (Reg. (EU) 2022/2554) became applicable on 17 January 2025, replaced with DORA references. No policy requirement or control changed.</w:t>
+              <w:t>Currency update: NIS-2 obligations restated against the BSIG as amended by the NIS-2-Umsetzungsgesetz (BGBl. 2025 I Nr. 301); entity classification corrected to wichtige Einrichtung under Sec. 28(2) BSIG, Anlage 1.</w:t>
             </w:r>
           </w:p>
         </w:tc>
@@ -659,7 +659,7 @@
               <w:rPr>
                 <w:rFonts w:ascii="Arial" w:hAnsi="Arial" w:cs="Arial"/>
               </w:rPr>
-              <w:t>1.1</w:t>
+              <w:t>1.2</w:t>
             </w:r>
           </w:p>
         </w:tc>
@@ -719,7 +719,7 @@
               <w:rPr>
                 <w:rFonts w:ascii="Arial" w:hAnsi="Arial" w:cs="Arial"/>
               </w:rPr>
-              <w:t>Currency update: NIS-2 obligations restated against the BSIG as amended by the NIS-2-Umsetzungsgesetz (BGBl. 2025 I Nr. 301); entity classification corrected to wichtige Einrichtung under Sec. 28(2) BSIG, Anlage 1.</w:t>
+              <w:t>Citation correction: BaFin BAIT, withdrawn when DORA (Reg. (EU) 2022/2554) became applicable on 17 January 2025, replaced with DORA references. No policy requirement or control changed.</w:t>
             </w:r>
           </w:p>
         </w:tc>

</xml_diff>